<commit_message>
Add governed QA stress evaluation tooling
</commit_message>
<xml_diff>
--- a/paper/collab_draft_revised.docx
+++ b/paper/collab_draft_revised.docx
@@ -2199,95 +2199,95 @@
           <w:sz w:val="24"/>
           <w:sz-cs w:val="24"/>
         </w:rPr>
-        <w:t xml:space="preserve">| Metric | flat_path_basic | domain_basic | domain_advanced |</w:t>
-      </w:r>
-    </w:p>
-    <w:p>
-      <w:pPr/>
-      <w:r>
-        <w:rPr>
-          <w:rFonts w:ascii="Helvetica Light" w:hAnsi="Helvetica Light" w:cs="Helvetica Light"/>
-          <w:sz w:val="24"/>
-          <w:sz-cs w:val="24"/>
-        </w:rPr>
-        <w:t xml:space="preserve">|---|---|---|---|</w:t>
-      </w:r>
-    </w:p>
-    <w:p>
-      <w:pPr/>
-      <w:r>
-        <w:rPr>
-          <w:rFonts w:ascii="Helvetica Light" w:hAnsi="Helvetica Light" w:cs="Helvetica Light"/>
-          <w:sz w:val="24"/>
-          <w:sz-cs w:val="24"/>
-        </w:rPr>
-        <w:t xml:space="preserve">| KGAFE score | 0.474 | 0.486 | 0.665 |</w:t>
-      </w:r>
-    </w:p>
-    <w:p>
-      <w:pPr/>
-      <w:r>
-        <w:rPr>
-          <w:rFonts w:ascii="Helvetica Light" w:hAnsi="Helvetica Light" w:cs="Helvetica Light"/>
-          <w:sz w:val="24"/>
-          <w:sz-cs w:val="24"/>
-        </w:rPr>
-        <w:t xml:space="preserve">| KG faithfulness | 0.625 | 0.672 | 1.000 |</w:t>
-      </w:r>
-    </w:p>
-    <w:p>
-      <w:pPr/>
-      <w:r>
-        <w:rPr>
-          <w:rFonts w:ascii="Helvetica Light" w:hAnsi="Helvetica Light" w:cs="Helvetica Light"/>
-          <w:sz w:val="24"/>
-          <w:sz-cs w:val="24"/>
-        </w:rPr>
-        <w:t xml:space="preserve">| KG precision | 0.583 | 0.651 | 0.896 |</w:t>
-      </w:r>
-    </w:p>
-    <w:p>
-      <w:pPr/>
-      <w:r>
-        <w:rPr>
-          <w:rFonts w:ascii="Helvetica Light" w:hAnsi="Helvetica Light" w:cs="Helvetica Light"/>
-          <w:sz w:val="24"/>
-          <w:sz-cs w:val="24"/>
-        </w:rPr>
-        <w:t xml:space="preserve">| Hallucination rate | 0.417 | 0.224 | 0.104 |</w:t>
-      </w:r>
-    </w:p>
-    <w:p>
-      <w:pPr/>
-      <w:r>
-        <w:rPr>
-          <w:rFonts w:ascii="Helvetica Light" w:hAnsi="Helvetica Light" w:cs="Helvetica Light"/>
-          <w:sz w:val="24"/>
-          <w:sz-cs w:val="24"/>
-        </w:rPr>
-        <w:t xml:space="preserve">| Coverage | 0.938 | 0.812 | 0.938 |</w:t>
-      </w:r>
-    </w:p>
-    <w:p>
-      <w:pPr/>
-      <w:r>
-        <w:rPr>
-          <w:rFonts w:ascii="Helvetica Light" w:hAnsi="Helvetica Light" w:cs="Helvetica Light"/>
-          <w:sz w:val="24"/>
-          <w:sz-cs w:val="24"/>
-        </w:rPr>
-        <w:t xml:space="preserve"/>
-      </w:r>
-    </w:p>
-    <w:p>
-      <w:pPr/>
-      <w:r>
-        <w:rPr>
-          <w:rFonts w:ascii="Helvetica Light" w:hAnsi="Helvetica Light" w:cs="Helvetica Light"/>
-          <w:sz w:val="24"/>
-          <w:sz-cs w:val="24"/>
-        </w:rPr>
-        <w:t xml:space="preserve">The most important comparison is between the flat-path baseline and the governed QA systems. Domain-routed QA nearly halves hallucination relative to the flat baseline while improving faithfulness and precision. The strongest result comes from the full governed stack, domain_advanced, which raises KGAFE from 0.474 to 0.665, drives KG faithfulness to 1.0, and lowers hallucination to 10.4%. This shows that the governed representation is not only better organized, but also more useful for grounded downstream reasoning.</w:t>
+        <w:t xml:space="preserve">| Metric | flat_path_basic | graphrag_basic | domain_basic | domain_advanced |</w:t>
+      </w:r>
+    </w:p>
+    <w:p>
+      <w:pPr/>
+      <w:r>
+        <w:rPr>
+          <w:rFonts w:ascii="Helvetica Light" w:hAnsi="Helvetica Light" w:cs="Helvetica Light"/>
+          <w:sz w:val="24"/>
+          <w:sz-cs w:val="24"/>
+        </w:rPr>
+        <w:t xml:space="preserve">|---|---|---|---|---|</w:t>
+      </w:r>
+    </w:p>
+    <w:p>
+      <w:pPr/>
+      <w:r>
+        <w:rPr>
+          <w:rFonts w:ascii="Helvetica Light" w:hAnsi="Helvetica Light" w:cs="Helvetica Light"/>
+          <w:sz w:val="24"/>
+          <w:sz-cs w:val="24"/>
+        </w:rPr>
+        <w:t xml:space="preserve">| Corrected grounded-QA score | 0.691 | 0.673 | 0.680 | 0.698 |</w:t>
+      </w:r>
+    </w:p>
+    <w:p>
+      <w:pPr/>
+      <w:r>
+        <w:rPr>
+          <w:rFonts w:ascii="Helvetica Light" w:hAnsi="Helvetica Light" w:cs="Helvetica Light"/>
+          <w:sz w:val="24"/>
+          <w:sz-cs w:val="24"/>
+        </w:rPr>
+        <w:t xml:space="preserve">| Faithfulness | 1.000 | 0.984 | 1.000 | 1.000 |</w:t>
+      </w:r>
+    </w:p>
+    <w:p>
+      <w:pPr/>
+      <w:r>
+        <w:rPr>
+          <w:rFonts w:ascii="Helvetica Light" w:hAnsi="Helvetica Light" w:cs="Helvetica Light"/>
+          <w:sz w:val="24"/>
+          <w:sz-cs w:val="24"/>
+        </w:rPr>
+        <w:t xml:space="preserve">| Precision / support | 1.000 | 0.984 | 0.958 | 0.991 |</w:t>
+      </w:r>
+    </w:p>
+    <w:p>
+      <w:pPr/>
+      <w:r>
+        <w:rPr>
+          <w:rFonts w:ascii="Helvetica Light" w:hAnsi="Helvetica Light" w:cs="Helvetica Light"/>
+          <w:sz w:val="24"/>
+          <w:sz-cs w:val="24"/>
+        </w:rPr>
+        <w:t xml:space="preserve">| Hallucination rate | 0.000 | 0.016 | 0.042 | 0.009 |</w:t>
+      </w:r>
+    </w:p>
+    <w:p>
+      <w:pPr/>
+      <w:r>
+        <w:rPr>
+          <w:rFonts w:ascii="Helvetica Light" w:hAnsi="Helvetica Light" w:cs="Helvetica Light"/>
+          <w:sz w:val="24"/>
+          <w:sz-cs w:val="24"/>
+        </w:rPr>
+        <w:t xml:space="preserve">| Coverage | 0.938 | 0.875 | 0.938 | 1.000 |</w:t>
+      </w:r>
+    </w:p>
+    <w:p>
+      <w:pPr/>
+      <w:r>
+        <w:rPr>
+          <w:rFonts w:ascii="Helvetica Light" w:hAnsi="Helvetica Light" w:cs="Helvetica Light"/>
+          <w:sz w:val="24"/>
+          <w:sz-cs w:val="24"/>
+        </w:rPr>
+        <w:t xml:space="preserve"/>
+      </w:r>
+    </w:p>
+    <w:p>
+      <w:pPr/>
+      <w:r>
+        <w:rPr>
+          <w:rFonts w:ascii="Helvetica Light" w:hAnsi="Helvetica Light" w:cs="Helvetica Light"/>
+          <w:sz w:val="24"/>
+          <w:sz-cs w:val="24"/>
+        </w:rPr>
+        <w:t xml:space="preserve">The main downstream comparison is now between four systems: a flat baseline, a GraphRAG-style community-summary baseline, a governed domain-routed baseline, and the full governed stack with critique and graph exploration. After correcting negative-question abstention scoring, GraphRAG no longer looks artificially broken; instead it behaves like a cautious graph-aware baseline with low hallucination but lower coverage than the governed system. The strongest result comes from the full governed stack, domain_advanced, which achieves the highest corrected composite score, full coverage, and near-perfect faithfulness and precision. This is the downstream version of the paper’s main claim: governance is not only producing a cleaner graph, but also a more useful graph for grounded question answering.</w:t>
       </w:r>
     </w:p>
     <w:p>

</xml_diff>